<commit_message>
test code for assignment 3 has been added
</commit_message>
<xml_diff>
--- a/Assignment 2/DSP_Assignment_2_ArdaVeer.docx
+++ b/Assignment 2/DSP_Assignment_2_ArdaVeer.docx
@@ -17,66 +17,6 @@
       </w:pPr>
       <w:r>
         <w:rPr>
-          <w:noProof/>
-        </w:rPr>
-        <w:drawing>
-          <wp:anchor distT="0" distB="0" distL="114300" distR="114300" simplePos="0" relativeHeight="251660288" behindDoc="1" locked="0" layoutInCell="1" allowOverlap="1" wp14:anchorId="34F71F8C" wp14:editId="22351FB5">
-            <wp:simplePos x="0" y="0"/>
-            <wp:positionH relativeFrom="column">
-              <wp:posOffset>3022600</wp:posOffset>
-            </wp:positionH>
-            <wp:positionV relativeFrom="paragraph">
-              <wp:posOffset>305435</wp:posOffset>
-            </wp:positionV>
-            <wp:extent cx="3013899" cy="2260600"/>
-            <wp:effectExtent l="0" t="0" r="0" b="0"/>
-            <wp:wrapNone/>
-            <wp:docPr id="1296033339" name="Graphic 2"/>
-            <wp:cNvGraphicFramePr>
-              <a:graphicFrameLocks xmlns:a="http://schemas.openxmlformats.org/drawingml/2006/main" noChangeAspect="1"/>
-            </wp:cNvGraphicFramePr>
-            <a:graphic xmlns:a="http://schemas.openxmlformats.org/drawingml/2006/main">
-              <a:graphicData uri="http://schemas.openxmlformats.org/drawingml/2006/picture">
-                <pic:pic xmlns:pic="http://schemas.openxmlformats.org/drawingml/2006/picture">
-                  <pic:nvPicPr>
-                    <pic:cNvPr id="1296033339" name="Graphic 1296033339"/>
-                    <pic:cNvPicPr/>
-                  </pic:nvPicPr>
-                  <pic:blipFill>
-                    <a:blip r:embed="rId8">
-                      <a:extLst>
-                        <a:ext uri="{96DAC541-7B7A-43D3-8B79-37D633B846F1}">
-                          <asvg:svgBlip xmlns:asvg="http://schemas.microsoft.com/office/drawing/2016/SVG/main" r:embed="rId9"/>
-                        </a:ext>
-                      </a:extLst>
-                    </a:blip>
-                    <a:stretch>
-                      <a:fillRect/>
-                    </a:stretch>
-                  </pic:blipFill>
-                  <pic:spPr>
-                    <a:xfrm>
-                      <a:off x="0" y="0"/>
-                      <a:ext cx="3022037" cy="2266704"/>
-                    </a:xfrm>
-                    <a:prstGeom prst="rect">
-                      <a:avLst/>
-                    </a:prstGeom>
-                  </pic:spPr>
-                </pic:pic>
-              </a:graphicData>
-            </a:graphic>
-            <wp14:sizeRelH relativeFrom="page">
-              <wp14:pctWidth>0</wp14:pctWidth>
-            </wp14:sizeRelH>
-            <wp14:sizeRelV relativeFrom="page">
-              <wp14:pctHeight>0</wp14:pctHeight>
-            </wp14:sizeRelV>
-          </wp:anchor>
-        </w:drawing>
-      </w:r>
-      <w:r>
-        <w:rPr>
           <w:b/>
           <w:bCs/>
         </w:rPr>
@@ -92,9 +32,9 @@
           <w:noProof/>
         </w:rPr>
         <w:drawing>
-          <wp:inline distT="0" distB="0" distL="0" distR="0" wp14:anchorId="44280A9C" wp14:editId="1928C039">
-            <wp:extent cx="2938176" cy="2260600"/>
-            <wp:effectExtent l="0" t="0" r="0" b="0"/>
+          <wp:inline distT="0" distB="0" distL="0" distR="0" wp14:anchorId="44280A9C" wp14:editId="27E1063A">
+            <wp:extent cx="2980268" cy="2292985"/>
+            <wp:effectExtent l="0" t="0" r="4445" b="5715"/>
             <wp:docPr id="1863648432" name="Graphic 1"/>
             <wp:cNvGraphicFramePr>
               <a:graphicFrameLocks xmlns:a="http://schemas.openxmlformats.org/drawingml/2006/main" noChangeAspect="1"/>
@@ -107,10 +47,10 @@
                     <pic:cNvPicPr/>
                   </pic:nvPicPr>
                   <pic:blipFill rotWithShape="1">
-                    <a:blip r:embed="rId10">
+                    <a:blip r:embed="rId8">
                       <a:extLst>
                         <a:ext uri="{96DAC541-7B7A-43D3-8B79-37D633B846F1}">
-                          <asvg:svgBlip xmlns:asvg="http://schemas.microsoft.com/office/drawing/2016/SVG/main" r:embed="rId11"/>
+                          <asvg:svgBlip xmlns:asvg="http://schemas.microsoft.com/office/drawing/2016/SVG/main" r:embed="rId9"/>
                         </a:ext>
                       </a:extLst>
                     </a:blip>
@@ -122,7 +62,7 @@
                   <pic:spPr bwMode="auto">
                     <a:xfrm>
                       <a:off x="0" y="0"/>
-                      <a:ext cx="3076842" cy="2367288"/>
+                      <a:ext cx="3100343" cy="2385369"/>
                     </a:xfrm>
                     <a:prstGeom prst="rect">
                       <a:avLst/>
@@ -142,6 +82,52 @@
           </wp:inline>
         </w:drawing>
       </w:r>
+      <w:r>
+        <w:rPr>
+          <w:noProof/>
+        </w:rPr>
+        <w:drawing>
+          <wp:inline distT="0" distB="0" distL="0" distR="0" wp14:anchorId="34F71F8C" wp14:editId="0E29DBAF">
+            <wp:extent cx="2922905" cy="2192178"/>
+            <wp:effectExtent l="0" t="0" r="0" b="5080"/>
+            <wp:docPr id="1296033339" name="Graphic 2"/>
+            <wp:cNvGraphicFramePr>
+              <a:graphicFrameLocks xmlns:a="http://schemas.openxmlformats.org/drawingml/2006/main" noChangeAspect="1"/>
+            </wp:cNvGraphicFramePr>
+            <a:graphic xmlns:a="http://schemas.openxmlformats.org/drawingml/2006/main">
+              <a:graphicData uri="http://schemas.openxmlformats.org/drawingml/2006/picture">
+                <pic:pic xmlns:pic="http://schemas.openxmlformats.org/drawingml/2006/picture">
+                  <pic:nvPicPr>
+                    <pic:cNvPr id="1296033339" name="Graphic 1296033339"/>
+                    <pic:cNvPicPr/>
+                  </pic:nvPicPr>
+                  <pic:blipFill>
+                    <a:blip r:embed="rId10">
+                      <a:extLst>
+                        <a:ext uri="{96DAC541-7B7A-43D3-8B79-37D633B846F1}">
+                          <asvg:svgBlip xmlns:asvg="http://schemas.microsoft.com/office/drawing/2016/SVG/main" r:embed="rId11"/>
+                        </a:ext>
+                      </a:extLst>
+                    </a:blip>
+                    <a:stretch>
+                      <a:fillRect/>
+                    </a:stretch>
+                  </pic:blipFill>
+                  <pic:spPr>
+                    <a:xfrm>
+                      <a:off x="0" y="0"/>
+                      <a:ext cx="2974371" cy="2230778"/>
+                    </a:xfrm>
+                    <a:prstGeom prst="rect">
+                      <a:avLst/>
+                    </a:prstGeom>
+                  </pic:spPr>
+                </pic:pic>
+              </a:graphicData>
+            </a:graphic>
+          </wp:inline>
+        </w:drawing>
+      </w:r>
     </w:p>
     <w:p>
       <w:pPr>
@@ -182,7 +168,10 @@
         <w:t>We recorded ECG using the Attys setup with a 500Hz sampling rate. For the ECG recording we have put the electrodes on ankles and wrists while standing upright. The ECG is in column 7 of the TSV file. We have plotted the ECG trace both in the time domain and the frequency domain. When the frequency domain ECG signal</w:t>
       </w:r>
       <w:r>
-        <w:t xml:space="preserve"> in figure 1</w:t>
+        <w:t xml:space="preserve"> in </w:t>
+      </w:r>
+      <w:r>
+        <w:t>figure 1</w:t>
       </w:r>
       <w:r>
         <w:t xml:space="preserve"> is taken into consideration </w:t>
@@ -661,9 +650,9 @@
           <w:noProof/>
         </w:rPr>
         <w:drawing>
-          <wp:inline distT="0" distB="0" distL="0" distR="0" wp14:anchorId="763495E2" wp14:editId="7CA06848">
-            <wp:extent cx="3887999" cy="2916000"/>
-            <wp:effectExtent l="0" t="0" r="0" b="5080"/>
+          <wp:inline distT="0" distB="0" distL="0" distR="0" wp14:anchorId="763495E2" wp14:editId="416E6B10">
+            <wp:extent cx="3808270" cy="2915603"/>
+            <wp:effectExtent l="0" t="0" r="1905" b="5715"/>
             <wp:docPr id="1681751807" name="Graphic 7"/>
             <wp:cNvGraphicFramePr>
               <a:graphicFrameLocks xmlns:a="http://schemas.openxmlformats.org/drawingml/2006/main" noChangeAspect="1"/>
@@ -675,7 +664,7 @@
                     <pic:cNvPr id="1681751807" name="Graphic 1681751807"/>
                     <pic:cNvPicPr/>
                   </pic:nvPicPr>
-                  <pic:blipFill>
+                  <pic:blipFill rotWithShape="1">
                     <a:blip r:embed="rId18">
                       <a:extLst>
                         <a:ext uri="{96DAC541-7B7A-43D3-8B79-37D633B846F1}">
@@ -683,18 +672,27 @@
                         </a:ext>
                       </a:extLst>
                     </a:blip>
+                    <a:srcRect l="2038"/>
                     <a:stretch>
                       <a:fillRect/>
                     </a:stretch>
                   </pic:blipFill>
-                  <pic:spPr>
+                  <pic:spPr bwMode="auto">
                     <a:xfrm>
                       <a:off x="0" y="0"/>
-                      <a:ext cx="3895048" cy="2921287"/>
+                      <a:ext cx="3815694" cy="2921287"/>
                     </a:xfrm>
                     <a:prstGeom prst="rect">
                       <a:avLst/>
                     </a:prstGeom>
+                    <a:ln>
+                      <a:noFill/>
+                    </a:ln>
+                    <a:extLst>
+                      <a:ext uri="{53640926-AAD7-44D8-BBD7-CCE9431645EC}">
+                        <a14:shadowObscured xmlns:a14="http://schemas.microsoft.com/office/drawing/2010/main"/>
+                      </a:ext>
+                    </a:extLst>
                   </pic:spPr>
                 </pic:pic>
               </a:graphicData>
@@ -810,9 +808,9 @@
           <w:noProof/>
         </w:rPr>
         <w:drawing>
-          <wp:inline distT="0" distB="0" distL="0" distR="0" wp14:anchorId="53DD9FA1" wp14:editId="1C0696C8">
-            <wp:extent cx="4279900" cy="3209922"/>
-            <wp:effectExtent l="0" t="0" r="0" b="3810"/>
+          <wp:inline distT="0" distB="0" distL="0" distR="0" wp14:anchorId="53DD9FA1" wp14:editId="515441B4">
+            <wp:extent cx="4675202" cy="3506400"/>
+            <wp:effectExtent l="0" t="0" r="0" b="0"/>
             <wp:docPr id="303914913" name="Graphic 8"/>
             <wp:cNvGraphicFramePr>
               <a:graphicFrameLocks xmlns:a="http://schemas.openxmlformats.org/drawingml/2006/main" noChangeAspect="1"/>
@@ -839,7 +837,7 @@
                   <pic:spPr>
                     <a:xfrm>
                       <a:off x="0" y="0"/>
-                      <a:ext cx="4402143" cy="3301604"/>
+                      <a:ext cx="4775250" cy="3581436"/>
                     </a:xfrm>
                     <a:prstGeom prst="rect">
                       <a:avLst/>
@@ -868,13 +866,13 @@
           <w:noProof/>
         </w:rPr>
         <w:drawing>
-          <wp:anchor distT="0" distB="0" distL="114300" distR="114300" simplePos="0" relativeHeight="251659264" behindDoc="0" locked="0" layoutInCell="1" allowOverlap="1" wp14:anchorId="6F92D0F5" wp14:editId="6E368669">
+          <wp:anchor distT="0" distB="0" distL="114300" distR="114300" simplePos="0" relativeHeight="251659264" behindDoc="0" locked="0" layoutInCell="1" allowOverlap="1" wp14:anchorId="6F92D0F5" wp14:editId="55C5C9F3">
             <wp:simplePos x="0" y="0"/>
             <wp:positionH relativeFrom="column">
-              <wp:posOffset>330200</wp:posOffset>
+              <wp:posOffset>330710</wp:posOffset>
             </wp:positionH>
             <wp:positionV relativeFrom="paragraph">
-              <wp:posOffset>292100</wp:posOffset>
+              <wp:posOffset>216730</wp:posOffset>
             </wp:positionV>
             <wp:extent cx="2483485" cy="1863090"/>
             <wp:effectExtent l="0" t="0" r="5715" b="3810"/>
@@ -1018,16 +1016,6 @@
     <w:p>
       <w:pPr>
         <w:spacing w:after="160" w:line="301" w:lineRule="auto"/>
-        <w:jc w:val="center"/>
-        <w:rPr>
-          <w:i/>
-          <w:iCs/>
-        </w:rPr>
-      </w:pPr>
-    </w:p>
-    <w:p>
-      <w:pPr>
-        <w:spacing w:after="160" w:line="301" w:lineRule="auto"/>
         <w:rPr>
           <w:i/>
           <w:iCs/>
@@ -1518,12 +1506,7 @@
       </w:r>
     </w:p>
     <w:sectPr>
-      <w:headerReference w:type="even" r:id="rId34"/>
-      <w:headerReference w:type="default" r:id="rId35"/>
-      <w:footerReference w:type="even" r:id="rId36"/>
-      <w:footerReference w:type="default" r:id="rId37"/>
-      <w:headerReference w:type="first" r:id="rId38"/>
-      <w:footerReference w:type="first" r:id="rId39"/>
+      <w:headerReference w:type="first" r:id="rId34"/>
       <w:pgSz w:w="12240" w:h="15840"/>
       <w:pgMar w:top="1440" w:right="1440" w:bottom="1440" w:left="1440" w:header="720" w:footer="720" w:gutter="0"/>
       <w:pgNumType w:start="1"/>
@@ -1560,36 +1543,6 @@
 </w:endnotes>
 </file>
 
-<file path=word/footer1.xml><?xml version="1.0" encoding="utf-8"?>
-<w:ftr xmlns:wpc="http://schemas.microsoft.com/office/word/2010/wordprocessingCanvas" xmlns:cx="http://schemas.microsoft.com/office/drawing/2014/chartex" xmlns:cx1="http://schemas.microsoft.com/office/drawing/2015/9/8/chartex" xmlns:cx2="http://schemas.microsoft.com/office/drawing/2015/10/21/chartex" xmlns:cx3="http://schemas.microsoft.com/office/drawing/2016/5/9/chartex" xmlns:cx4="http://schemas.microsoft.com/office/drawing/2016/5/10/chartex" xmlns:cx5="http://schemas.microsoft.com/office/drawing/2016/5/11/chartex" xmlns:cx6="http://schemas.microsoft.com/office/drawing/2016/5/12/chartex" xmlns:cx7="http://schemas.microsoft.com/office/drawing/2016/5/13/chartex" xmlns:cx8="http://schemas.microsoft.com/office/drawing/2016/5/14/chartex" xmlns:mc="http://schemas.openxmlformats.org/markup-compatibility/2006" xmlns:aink="http://schemas.microsoft.com/office/drawing/2016/ink" xmlns:am3d="http://schemas.microsoft.com/office/drawing/2017/model3d" xmlns:o="urn:schemas-microsoft-com:office:office" xmlns:oel="http://schemas.microsoft.com/office/2019/extlst" xmlns:r="http://schemas.openxmlformats.org/officeDocument/2006/relationships" xmlns:m="http://schemas.openxmlformats.org/officeDocument/2006/math" xmlns:v="urn:schemas-microsoft-com:vml" xmlns:wp14="http://schemas.microsoft.com/office/word/2010/wordprocessingDrawing" xmlns:wp="http://schemas.openxmlformats.org/drawingml/2006/wordprocessingDrawing" xmlns:w10="urn:schemas-microsoft-com:office:word" xmlns:w="http://schemas.openxmlformats.org/wordprocessingml/2006/main" xmlns:w14="http://schemas.microsoft.com/office/word/2010/wordml" xmlns:w15="http://schemas.microsoft.com/office/word/2012/wordml" xmlns:w16cex="http://schemas.microsoft.com/office/word/2018/wordml/cex" xmlns:w16cid="http://schemas.microsoft.com/office/word/2016/wordml/cid" xmlns:w16="http://schemas.microsoft.com/office/word/2018/wordml" xmlns:w16du="http://schemas.microsoft.com/office/word/2023/wordml/word16du" xmlns:w16sdtdh="http://schemas.microsoft.com/office/word/2020/wordml/sdtdatahash" xmlns:w16sdtfl="http://schemas.microsoft.com/office/word/2024/wordml/sdtformatlock" xmlns:w16se="http://schemas.microsoft.com/office/word/2015/wordml/symex" xmlns:wpg="http://schemas.microsoft.com/office/word/2010/wordprocessingGroup" xmlns:wpi="http://schemas.microsoft.com/office/word/2010/wordprocessingInk" xmlns:wne="http://schemas.microsoft.com/office/word/2006/wordml" xmlns:wps="http://schemas.microsoft.com/office/word/2010/wordprocessingShape" mc:Ignorable="w14 w15 w16se w16cid w16 w16cex w16sdtdh w16sdtfl w16du wp14">
-  <w:p>
-    <w:pPr>
-      <w:pStyle w:val="Footer"/>
-    </w:pPr>
-  </w:p>
-</w:ftr>
-</file>
-
-<file path=word/footer2.xml><?xml version="1.0" encoding="utf-8"?>
-<w:ftr xmlns:wpc="http://schemas.microsoft.com/office/word/2010/wordprocessingCanvas" xmlns:cx="http://schemas.microsoft.com/office/drawing/2014/chartex" xmlns:cx1="http://schemas.microsoft.com/office/drawing/2015/9/8/chartex" xmlns:cx2="http://schemas.microsoft.com/office/drawing/2015/10/21/chartex" xmlns:cx3="http://schemas.microsoft.com/office/drawing/2016/5/9/chartex" xmlns:cx4="http://schemas.microsoft.com/office/drawing/2016/5/10/chartex" xmlns:cx5="http://schemas.microsoft.com/office/drawing/2016/5/11/chartex" xmlns:cx6="http://schemas.microsoft.com/office/drawing/2016/5/12/chartex" xmlns:cx7="http://schemas.microsoft.com/office/drawing/2016/5/13/chartex" xmlns:cx8="http://schemas.microsoft.com/office/drawing/2016/5/14/chartex" xmlns:mc="http://schemas.openxmlformats.org/markup-compatibility/2006" xmlns:aink="http://schemas.microsoft.com/office/drawing/2016/ink" xmlns:am3d="http://schemas.microsoft.com/office/drawing/2017/model3d" xmlns:o="urn:schemas-microsoft-com:office:office" xmlns:oel="http://schemas.microsoft.com/office/2019/extlst" xmlns:r="http://schemas.openxmlformats.org/officeDocument/2006/relationships" xmlns:m="http://schemas.openxmlformats.org/officeDocument/2006/math" xmlns:v="urn:schemas-microsoft-com:vml" xmlns:wp14="http://schemas.microsoft.com/office/word/2010/wordprocessingDrawing" xmlns:wp="http://schemas.openxmlformats.org/drawingml/2006/wordprocessingDrawing" xmlns:w10="urn:schemas-microsoft-com:office:word" xmlns:w="http://schemas.openxmlformats.org/wordprocessingml/2006/main" xmlns:w14="http://schemas.microsoft.com/office/word/2010/wordml" xmlns:w15="http://schemas.microsoft.com/office/word/2012/wordml" xmlns:w16cex="http://schemas.microsoft.com/office/word/2018/wordml/cex" xmlns:w16cid="http://schemas.microsoft.com/office/word/2016/wordml/cid" xmlns:w16="http://schemas.microsoft.com/office/word/2018/wordml" xmlns:w16du="http://schemas.microsoft.com/office/word/2023/wordml/word16du" xmlns:w16sdtdh="http://schemas.microsoft.com/office/word/2020/wordml/sdtdatahash" xmlns:w16sdtfl="http://schemas.microsoft.com/office/word/2024/wordml/sdtformatlock" xmlns:w16se="http://schemas.microsoft.com/office/word/2015/wordml/symex" xmlns:wpg="http://schemas.microsoft.com/office/word/2010/wordprocessingGroup" xmlns:wpi="http://schemas.microsoft.com/office/word/2010/wordprocessingInk" xmlns:wne="http://schemas.microsoft.com/office/word/2006/wordml" xmlns:wps="http://schemas.microsoft.com/office/word/2010/wordprocessingShape" mc:Ignorable="w14 w15 w16se w16cid w16 w16cex w16sdtdh w16sdtfl w16du wp14">
-  <w:p>
-    <w:pPr>
-      <w:pStyle w:val="Footer"/>
-    </w:pPr>
-  </w:p>
-</w:ftr>
-</file>
-
-<file path=word/footer3.xml><?xml version="1.0" encoding="utf-8"?>
-<w:ftr xmlns:wpc="http://schemas.microsoft.com/office/word/2010/wordprocessingCanvas" xmlns:cx="http://schemas.microsoft.com/office/drawing/2014/chartex" xmlns:cx1="http://schemas.microsoft.com/office/drawing/2015/9/8/chartex" xmlns:cx2="http://schemas.microsoft.com/office/drawing/2015/10/21/chartex" xmlns:cx3="http://schemas.microsoft.com/office/drawing/2016/5/9/chartex" xmlns:cx4="http://schemas.microsoft.com/office/drawing/2016/5/10/chartex" xmlns:cx5="http://schemas.microsoft.com/office/drawing/2016/5/11/chartex" xmlns:cx6="http://schemas.microsoft.com/office/drawing/2016/5/12/chartex" xmlns:cx7="http://schemas.microsoft.com/office/drawing/2016/5/13/chartex" xmlns:cx8="http://schemas.microsoft.com/office/drawing/2016/5/14/chartex" xmlns:mc="http://schemas.openxmlformats.org/markup-compatibility/2006" xmlns:aink="http://schemas.microsoft.com/office/drawing/2016/ink" xmlns:am3d="http://schemas.microsoft.com/office/drawing/2017/model3d" xmlns:o="urn:schemas-microsoft-com:office:office" xmlns:oel="http://schemas.microsoft.com/office/2019/extlst" xmlns:r="http://schemas.openxmlformats.org/officeDocument/2006/relationships" xmlns:m="http://schemas.openxmlformats.org/officeDocument/2006/math" xmlns:v="urn:schemas-microsoft-com:vml" xmlns:wp14="http://schemas.microsoft.com/office/word/2010/wordprocessingDrawing" xmlns:wp="http://schemas.openxmlformats.org/drawingml/2006/wordprocessingDrawing" xmlns:w10="urn:schemas-microsoft-com:office:word" xmlns:w="http://schemas.openxmlformats.org/wordprocessingml/2006/main" xmlns:w14="http://schemas.microsoft.com/office/word/2010/wordml" xmlns:w15="http://schemas.microsoft.com/office/word/2012/wordml" xmlns:w16cex="http://schemas.microsoft.com/office/word/2018/wordml/cex" xmlns:w16cid="http://schemas.microsoft.com/office/word/2016/wordml/cid" xmlns:w16="http://schemas.microsoft.com/office/word/2018/wordml" xmlns:w16du="http://schemas.microsoft.com/office/word/2023/wordml/word16du" xmlns:w16sdtdh="http://schemas.microsoft.com/office/word/2020/wordml/sdtdatahash" xmlns:w16sdtfl="http://schemas.microsoft.com/office/word/2024/wordml/sdtformatlock" xmlns:w16se="http://schemas.microsoft.com/office/word/2015/wordml/symex" xmlns:wpg="http://schemas.microsoft.com/office/word/2010/wordprocessingGroup" xmlns:wpi="http://schemas.microsoft.com/office/word/2010/wordprocessingInk" xmlns:wne="http://schemas.microsoft.com/office/word/2006/wordml" xmlns:wps="http://schemas.microsoft.com/office/word/2010/wordprocessingShape" mc:Ignorable="w14 w15 w16se w16cid w16 w16cex w16sdtdh w16sdtfl w16du wp14">
-  <w:p>
-    <w:pPr>
-      <w:pStyle w:val="Footer"/>
-    </w:pPr>
-  </w:p>
-</w:ftr>
-</file>
-
 <file path=word/footnotes.xml><?xml version="1.0" encoding="utf-8"?>
 <w:footnotes xmlns:wpc="http://schemas.microsoft.com/office/word/2010/wordprocessingCanvas" xmlns:cx="http://schemas.microsoft.com/office/drawing/2014/chartex" xmlns:cx1="http://schemas.microsoft.com/office/drawing/2015/9/8/chartex" xmlns:cx2="http://schemas.microsoft.com/office/drawing/2015/10/21/chartex" xmlns:cx3="http://schemas.microsoft.com/office/drawing/2016/5/9/chartex" xmlns:cx4="http://schemas.microsoft.com/office/drawing/2016/5/10/chartex" xmlns:cx5="http://schemas.microsoft.com/office/drawing/2016/5/11/chartex" xmlns:cx6="http://schemas.microsoft.com/office/drawing/2016/5/12/chartex" xmlns:cx7="http://schemas.microsoft.com/office/drawing/2016/5/13/chartex" xmlns:cx8="http://schemas.microsoft.com/office/drawing/2016/5/14/chartex" xmlns:mc="http://schemas.openxmlformats.org/markup-compatibility/2006" xmlns:aink="http://schemas.microsoft.com/office/drawing/2016/ink" xmlns:am3d="http://schemas.microsoft.com/office/drawing/2017/model3d" xmlns:o="urn:schemas-microsoft-com:office:office" xmlns:oel="http://schemas.microsoft.com/office/2019/extlst" xmlns:r="http://schemas.openxmlformats.org/officeDocument/2006/relationships" xmlns:m="http://schemas.openxmlformats.org/officeDocument/2006/math" xmlns:v="urn:schemas-microsoft-com:vml" xmlns:wp14="http://schemas.microsoft.com/office/word/2010/wordprocessingDrawing" xmlns:wp="http://schemas.openxmlformats.org/drawingml/2006/wordprocessingDrawing" xmlns:w10="urn:schemas-microsoft-com:office:word" xmlns:w="http://schemas.openxmlformats.org/wordprocessingml/2006/main" xmlns:w14="http://schemas.microsoft.com/office/word/2010/wordml" xmlns:w15="http://schemas.microsoft.com/office/word/2012/wordml" xmlns:w16cex="http://schemas.microsoft.com/office/word/2018/wordml/cex" xmlns:w16cid="http://schemas.microsoft.com/office/word/2016/wordml/cid" xmlns:w16="http://schemas.microsoft.com/office/word/2018/wordml" xmlns:w16du="http://schemas.microsoft.com/office/word/2023/wordml/word16du" xmlns:w16sdtdh="http://schemas.microsoft.com/office/word/2020/wordml/sdtdatahash" xmlns:w16sdtfl="http://schemas.microsoft.com/office/word/2024/wordml/sdtformatlock" xmlns:w16se="http://schemas.microsoft.com/office/word/2015/wordml/symex" xmlns:wpg="http://schemas.microsoft.com/office/word/2010/wordprocessingGroup" xmlns:wpi="http://schemas.microsoft.com/office/word/2010/wordprocessingInk" xmlns:wne="http://schemas.microsoft.com/office/word/2006/wordml" xmlns:wps="http://schemas.microsoft.com/office/word/2010/wordprocessingShape" mc:Ignorable="w14 w15 w16se w16cid w16 w16cex w16sdtdh w16sdtfl w16du wp14">
   <w:footnote w:type="separator" w:id="-1">
@@ -1620,35 +1573,37 @@
   <w:p>
     <w:pPr>
       <w:pStyle w:val="Header"/>
-    </w:pPr>
-  </w:p>
-</w:hdr>
-</file>
-
-<file path=word/header2.xml><?xml version="1.0" encoding="utf-8"?>
-<w:hdr xmlns:wpc="http://schemas.microsoft.com/office/word/2010/wordprocessingCanvas" xmlns:cx="http://schemas.microsoft.com/office/drawing/2014/chartex" xmlns:cx1="http://schemas.microsoft.com/office/drawing/2015/9/8/chartex" xmlns:cx2="http://schemas.microsoft.com/office/drawing/2015/10/21/chartex" xmlns:cx3="http://schemas.microsoft.com/office/drawing/2016/5/9/chartex" xmlns:cx4="http://schemas.microsoft.com/office/drawing/2016/5/10/chartex" xmlns:cx5="http://schemas.microsoft.com/office/drawing/2016/5/11/chartex" xmlns:cx6="http://schemas.microsoft.com/office/drawing/2016/5/12/chartex" xmlns:cx7="http://schemas.microsoft.com/office/drawing/2016/5/13/chartex" xmlns:cx8="http://schemas.microsoft.com/office/drawing/2016/5/14/chartex" xmlns:mc="http://schemas.openxmlformats.org/markup-compatibility/2006" xmlns:aink="http://schemas.microsoft.com/office/drawing/2016/ink" xmlns:am3d="http://schemas.microsoft.com/office/drawing/2017/model3d" xmlns:o="urn:schemas-microsoft-com:office:office" xmlns:oel="http://schemas.microsoft.com/office/2019/extlst" xmlns:r="http://schemas.openxmlformats.org/officeDocument/2006/relationships" xmlns:m="http://schemas.openxmlformats.org/officeDocument/2006/math" xmlns:v="urn:schemas-microsoft-com:vml" xmlns:wp14="http://schemas.microsoft.com/office/word/2010/wordprocessingDrawing" xmlns:wp="http://schemas.openxmlformats.org/drawingml/2006/wordprocessingDrawing" xmlns:w10="urn:schemas-microsoft-com:office:word" xmlns:w="http://schemas.openxmlformats.org/wordprocessingml/2006/main" xmlns:w14="http://schemas.microsoft.com/office/word/2010/wordml" xmlns:w15="http://schemas.microsoft.com/office/word/2012/wordml" xmlns:w16cex="http://schemas.microsoft.com/office/word/2018/wordml/cex" xmlns:w16cid="http://schemas.microsoft.com/office/word/2016/wordml/cid" xmlns:w16="http://schemas.microsoft.com/office/word/2018/wordml" xmlns:w16du="http://schemas.microsoft.com/office/word/2023/wordml/word16du" xmlns:w16sdtdh="http://schemas.microsoft.com/office/word/2020/wordml/sdtdatahash" xmlns:w16sdtfl="http://schemas.microsoft.com/office/word/2024/wordml/sdtformatlock" xmlns:w16se="http://schemas.microsoft.com/office/word/2015/wordml/symex" xmlns:wpg="http://schemas.microsoft.com/office/word/2010/wordprocessingGroup" xmlns:wpi="http://schemas.microsoft.com/office/word/2010/wordprocessingInk" xmlns:wne="http://schemas.microsoft.com/office/word/2006/wordml" xmlns:wps="http://schemas.microsoft.com/office/word/2010/wordprocessingShape" mc:Ignorable="w14 w15 w16se w16cid w16 w16cex w16sdtdh w16sdtfl w16du wp14">
-  <w:p>
-    <w:pPr>
-      <w:pStyle w:val="Header"/>
-    </w:pPr>
-  </w:p>
-</w:hdr>
-</file>
-
-<file path=word/header3.xml><?xml version="1.0" encoding="utf-8"?>
-<w:hdr xmlns:wpc="http://schemas.microsoft.com/office/word/2010/wordprocessingCanvas" xmlns:cx="http://schemas.microsoft.com/office/drawing/2014/chartex" xmlns:cx1="http://schemas.microsoft.com/office/drawing/2015/9/8/chartex" xmlns:cx2="http://schemas.microsoft.com/office/drawing/2015/10/21/chartex" xmlns:cx3="http://schemas.microsoft.com/office/drawing/2016/5/9/chartex" xmlns:cx4="http://schemas.microsoft.com/office/drawing/2016/5/10/chartex" xmlns:cx5="http://schemas.microsoft.com/office/drawing/2016/5/11/chartex" xmlns:cx6="http://schemas.microsoft.com/office/drawing/2016/5/12/chartex" xmlns:cx7="http://schemas.microsoft.com/office/drawing/2016/5/13/chartex" xmlns:cx8="http://schemas.microsoft.com/office/drawing/2016/5/14/chartex" xmlns:mc="http://schemas.openxmlformats.org/markup-compatibility/2006" xmlns:aink="http://schemas.microsoft.com/office/drawing/2016/ink" xmlns:am3d="http://schemas.microsoft.com/office/drawing/2017/model3d" xmlns:o="urn:schemas-microsoft-com:office:office" xmlns:oel="http://schemas.microsoft.com/office/2019/extlst" xmlns:r="http://schemas.openxmlformats.org/officeDocument/2006/relationships" xmlns:m="http://schemas.openxmlformats.org/officeDocument/2006/math" xmlns:v="urn:schemas-microsoft-com:vml" xmlns:wp14="http://schemas.microsoft.com/office/word/2010/wordprocessingDrawing" xmlns:wp="http://schemas.openxmlformats.org/drawingml/2006/wordprocessingDrawing" xmlns:w10="urn:schemas-microsoft-com:office:word" xmlns:w="http://schemas.openxmlformats.org/wordprocessingml/2006/main" xmlns:w14="http://schemas.microsoft.com/office/word/2010/wordml" xmlns:w15="http://schemas.microsoft.com/office/word/2012/wordml" xmlns:w16cex="http://schemas.microsoft.com/office/word/2018/wordml/cex" xmlns:w16cid="http://schemas.microsoft.com/office/word/2016/wordml/cid" xmlns:w16="http://schemas.microsoft.com/office/word/2018/wordml" xmlns:w16du="http://schemas.microsoft.com/office/word/2023/wordml/word16du" xmlns:w16sdtdh="http://schemas.microsoft.com/office/word/2020/wordml/sdtdatahash" xmlns:w16sdtfl="http://schemas.microsoft.com/office/word/2024/wordml/sdtformatlock" xmlns:w16se="http://schemas.microsoft.com/office/word/2015/wordml/symex" xmlns:wpg="http://schemas.microsoft.com/office/word/2010/wordprocessingGroup" xmlns:wpi="http://schemas.microsoft.com/office/word/2010/wordprocessingInk" xmlns:wne="http://schemas.microsoft.com/office/word/2006/wordml" xmlns:wps="http://schemas.microsoft.com/office/word/2010/wordprocessingShape" mc:Ignorable="w14 w15 w16se w16cid w16 w16cex w16sdtdh w16sdtfl w16du wp14">
-  <w:p>
-    <w:pPr>
-      <w:pStyle w:val="Header"/>
       <w:rPr>
         <w:lang w:val="tr-TR"/>
       </w:rPr>
     </w:pPr>
+    <w:proofErr w:type="spellStart"/>
     <w:r>
       <w:rPr>
         <w:lang w:val="tr-TR"/>
       </w:rPr>
-      <w:t>Veer Gokhale 3160362G</w:t>
+      <w:t>Veer</w:t>
+    </w:r>
+    <w:proofErr w:type="spellEnd"/>
+    <w:r>
+      <w:rPr>
+        <w:lang w:val="tr-TR"/>
+      </w:rPr>
+      <w:t xml:space="preserve"> </w:t>
+    </w:r>
+    <w:proofErr w:type="spellStart"/>
+    <w:r>
+      <w:rPr>
+        <w:lang w:val="tr-TR"/>
+      </w:rPr>
+      <w:t>Gokhale</w:t>
+    </w:r>
+    <w:proofErr w:type="spellEnd"/>
+    <w:r>
+      <w:rPr>
+        <w:lang w:val="tr-TR"/>
+      </w:rPr>
+      <w:t xml:space="preserve"> 3160362G</w:t>
     </w:r>
   </w:p>
   <w:p>
@@ -2956,7 +2911,7 @@
 </file>
 
 <file path=customXml/itemProps1.xml><?xml version="1.0" encoding="utf-8"?>
-<ds:datastoreItem xmlns:ds="http://schemas.openxmlformats.org/officeDocument/2006/customXml" ds:itemID="{F35F4633-0E54-0344-B3BE-F3A663EC9C69}">
+<ds:datastoreItem xmlns:ds="http://schemas.openxmlformats.org/officeDocument/2006/customXml" ds:itemID="{2CA1CC17-136D-3D4F-A8FD-806D1BB54DA2}">
   <ds:schemaRefs>
     <ds:schemaRef ds:uri="http://schemas.openxmlformats.org/officeDocument/2006/bibliography"/>
   </ds:schemaRefs>

</xml_diff>